<commit_message>
Q2: give colour answers only, without explanations
Co-Authored-By: Claude Opus 5.5 <noreply@anthropic.com>
Claude-Session: https://claude.ai/code/session_01NvTkAHSaZ21cNjKtHfhBfz
</commit_message>
<xml_diff>
--- a/pharm610_assignment3/Assignment_III_Pharm610_Answers.docx
+++ b/pharm610_assignment3/Assignment_III_Pharm610_Answers.docx
@@ -1139,462 +1139,105 @@
         <w:spacing w:after="100"/>
       </w:pPr>
       <w:r>
-        <w:t xml:space="preserve">The intercept of the correlogram (the y-value as τ → 0) reflects signal-to-noise. For a good measurement it is high but below 1 (≈ 0.8–0.95). The decay time reflects particle diffusion, and the baseline should return smoothly to zero.</w:t>
-      </w:r>
-    </w:p>
-    <w:tbl>
-      <w:tblPr>
-        <w:tblW w:type="dxa" w:w="9360"/>
-        <w:tblBorders>
-          <w:top w:val="single" w:color="auto" w:sz="4"/>
-          <w:left w:val="single" w:color="auto" w:sz="4"/>
-          <w:bottom w:val="single" w:color="auto" w:sz="4"/>
-          <w:right w:val="single" w:color="auto" w:sz="4"/>
-          <w:insideH w:val="single" w:color="auto" w:sz="4"/>
-          <w:insideV w:val="single" w:color="auto" w:sz="4"/>
-        </w:tblBorders>
-      </w:tblPr>
-      <w:tblGrid>
-        <w:gridCol w:w="1300"/>
-        <w:gridCol w:w="2200"/>
-        <w:gridCol w:w="5860"/>
-      </w:tblGrid>
-      <w:tr>
-        <w:trPr>
-          <w:tblHeader/>
-        </w:trPr>
-        <w:tc>
-          <w:tcPr>
-            <w:tcW w:type="dxa" w:w="1300"/>
-            <w:tcBorders>
-              <w:top w:val="single" w:color="A6A6A6" w:sz="4"/>
-              <w:left w:val="single" w:color="A6A6A6" w:sz="4"/>
-              <w:bottom w:val="single" w:color="A6A6A6" w:sz="4"/>
-              <w:right w:val="single" w:color="A6A6A6" w:sz="4"/>
-            </w:tcBorders>
-            <w:shd w:fill="D9E2F3" w:color="auto" w:val="clear"/>
-            <w:tcMar>
-              <w:top w:type="dxa" w:w="60"/>
-              <w:left w:type="dxa" w:w="100"/>
-              <w:bottom w:type="dxa" w:w="60"/>
-              <w:right w:type="dxa" w:w="100"/>
-            </w:tcMar>
-          </w:tcPr>
-          <w:p>
-            <w:r>
-              <w:rPr>
-                <w:b/>
-                <w:bCs/>
-              </w:rPr>
-              <w:t xml:space="preserve">Colour</w:t>
-            </w:r>
-          </w:p>
-        </w:tc>
-        <w:tc>
-          <w:tcPr>
-            <w:tcW w:type="dxa" w:w="2200"/>
-            <w:tcBorders>
-              <w:top w:val="single" w:color="A6A6A6" w:sz="4"/>
-              <w:left w:val="single" w:color="A6A6A6" w:sz="4"/>
-              <w:bottom w:val="single" w:color="A6A6A6" w:sz="4"/>
-              <w:right w:val="single" w:color="A6A6A6" w:sz="4"/>
-            </w:tcBorders>
-            <w:shd w:fill="D9E2F3" w:color="auto" w:val="clear"/>
-            <w:tcMar>
-              <w:top w:type="dxa" w:w="60"/>
-              <w:left w:type="dxa" w:w="100"/>
-              <w:bottom w:type="dxa" w:w="60"/>
-              <w:right w:type="dxa" w:w="100"/>
-            </w:tcMar>
-          </w:tcPr>
-          <w:p>
-            <w:r>
-              <w:rPr>
-                <w:b/>
-                <w:bCs/>
-              </w:rPr>
-              <w:t xml:space="preserve">Statement</w:t>
-            </w:r>
-          </w:p>
-        </w:tc>
-        <w:tc>
-          <w:tcPr>
-            <w:tcW w:type="dxa" w:w="5860"/>
-            <w:tcBorders>
-              <w:top w:val="single" w:color="A6A6A6" w:sz="4"/>
-              <w:left w:val="single" w:color="A6A6A6" w:sz="4"/>
-              <w:bottom w:val="single" w:color="A6A6A6" w:sz="4"/>
-              <w:right w:val="single" w:color="A6A6A6" w:sz="4"/>
-            </w:tcBorders>
-            <w:shd w:fill="D9E2F3" w:color="auto" w:val="clear"/>
-            <w:tcMar>
-              <w:top w:type="dxa" w:w="60"/>
-              <w:left w:type="dxa" w:w="100"/>
-              <w:bottom w:type="dxa" w:w="60"/>
-              <w:right w:type="dxa" w:w="100"/>
-            </w:tcMar>
-          </w:tcPr>
-          <w:p>
-            <w:r>
-              <w:rPr>
-                <w:b/>
-                <w:bCs/>
-              </w:rPr>
-              <w:t xml:space="preserve">Evidence in the graph</w:t>
-            </w:r>
-          </w:p>
-        </w:tc>
-      </w:tr>
-      <w:tr>
-        <w:trPr>
-          <w:tblHeader w:val="false"/>
-        </w:trPr>
-        <w:tc>
-          <w:tcPr>
-            <w:tcW w:type="dxa" w:w="1300"/>
-            <w:tcBorders>
-              <w:top w:val="single" w:color="A6A6A6" w:sz="4"/>
-              <w:left w:val="single" w:color="A6A6A6" w:sz="4"/>
-              <w:bottom w:val="single" w:color="A6A6A6" w:sz="4"/>
-              <w:right w:val="single" w:color="A6A6A6" w:sz="4"/>
-            </w:tcBorders>
-            <w:tcMar>
-              <w:top w:type="dxa" w:w="60"/>
-              <w:left w:type="dxa" w:w="100"/>
-              <w:bottom w:type="dxa" w:w="60"/>
-              <w:right w:type="dxa" w:w="100"/>
-            </w:tcMar>
-          </w:tcPr>
-          <w:p>
-            <w:r>
-              <w:rPr>
-                <w:b/>
-                <w:bCs/>
-              </w:rPr>
-              <w:t xml:space="preserve">Blue</w:t>
-            </w:r>
-          </w:p>
-        </w:tc>
-        <w:tc>
-          <w:tcPr>
-            <w:tcW w:type="dxa" w:w="2200"/>
-            <w:tcBorders>
-              <w:top w:val="single" w:color="A6A6A6" w:sz="4"/>
-              <w:left w:val="single" w:color="A6A6A6" w:sz="4"/>
-              <w:bottom w:val="single" w:color="A6A6A6" w:sz="4"/>
-              <w:right w:val="single" w:color="A6A6A6" w:sz="4"/>
-            </w:tcBorders>
-            <w:tcMar>
-              <w:top w:type="dxa" w:w="60"/>
-              <w:left w:type="dxa" w:w="100"/>
-              <w:bottom w:type="dxa" w:w="60"/>
-              <w:right w:type="dxa" w:w="100"/>
-            </w:tcMar>
-          </w:tcPr>
-          <w:p>
-            <w:r>
-              <w:rPr>
-                <w:b/>
-                <w:bCs/>
-              </w:rPr>
-              <w:t xml:space="preserve">Good measurement</w:t>
-            </w:r>
-          </w:p>
-        </w:tc>
-        <w:tc>
-          <w:tcPr>
-            <w:tcW w:type="dxa" w:w="5860"/>
-            <w:tcBorders>
-              <w:top w:val="single" w:color="A6A6A6" w:sz="4"/>
-              <w:left w:val="single" w:color="A6A6A6" w:sz="4"/>
-              <w:bottom w:val="single" w:color="A6A6A6" w:sz="4"/>
-              <w:right w:val="single" w:color="A6A6A6" w:sz="4"/>
-            </w:tcBorders>
-            <w:tcMar>
-              <w:top w:type="dxa" w:w="60"/>
-              <w:left w:type="dxa" w:w="100"/>
-              <w:bottom w:type="dxa" w:w="60"/>
-              <w:right w:type="dxa" w:w="100"/>
-            </w:tcMar>
-          </w:tcPr>
-          <w:p>
-            <w:r>
-              <w:t xml:space="preserve">Intercept ≈ 0.9 (in the ideal range), a single smooth decay, and a flat baseline that returns cleanly to zero.</w:t>
-            </w:r>
-          </w:p>
-        </w:tc>
-      </w:tr>
-      <w:tr>
-        <w:trPr>
-          <w:tblHeader w:val="false"/>
-        </w:trPr>
-        <w:tc>
-          <w:tcPr>
-            <w:tcW w:type="dxa" w:w="1300"/>
-            <w:tcBorders>
-              <w:top w:val="single" w:color="A6A6A6" w:sz="4"/>
-              <w:left w:val="single" w:color="A6A6A6" w:sz="4"/>
-              <w:bottom w:val="single" w:color="A6A6A6" w:sz="4"/>
-              <w:right w:val="single" w:color="A6A6A6" w:sz="4"/>
-            </w:tcBorders>
-            <w:tcMar>
-              <w:top w:type="dxa" w:w="60"/>
-              <w:left w:type="dxa" w:w="100"/>
-              <w:bottom w:type="dxa" w:w="60"/>
-              <w:right w:type="dxa" w:w="100"/>
-            </w:tcMar>
-          </w:tcPr>
-          <w:p>
-            <w:r>
-              <w:rPr>
-                <w:b/>
-                <w:bCs/>
-              </w:rPr>
-              <w:t xml:space="preserve">Green</w:t>
-            </w:r>
-          </w:p>
-        </w:tc>
-        <w:tc>
-          <w:tcPr>
-            <w:tcW w:type="dxa" w:w="2200"/>
-            <w:tcBorders>
-              <w:top w:val="single" w:color="A6A6A6" w:sz="4"/>
-              <w:left w:val="single" w:color="A6A6A6" w:sz="4"/>
-              <w:bottom w:val="single" w:color="A6A6A6" w:sz="4"/>
-              <w:right w:val="single" w:color="A6A6A6" w:sz="4"/>
-            </w:tcBorders>
-            <w:tcMar>
-              <w:top w:type="dxa" w:w="60"/>
-              <w:left w:type="dxa" w:w="100"/>
-              <w:bottom w:type="dxa" w:w="60"/>
-              <w:right w:type="dxa" w:w="100"/>
-            </w:tcMar>
-          </w:tcPr>
-          <w:p>
-            <w:r>
-              <w:rPr>
-                <w:b/>
-                <w:bCs/>
-              </w:rPr>
-              <w:t xml:space="preserve">Multiple scattering</w:t>
-            </w:r>
-          </w:p>
-        </w:tc>
-        <w:tc>
-          <w:tcPr>
-            <w:tcW w:type="dxa" w:w="5860"/>
-            <w:tcBorders>
-              <w:top w:val="single" w:color="A6A6A6" w:sz="4"/>
-              <w:left w:val="single" w:color="A6A6A6" w:sz="4"/>
-              <w:bottom w:val="single" w:color="A6A6A6" w:sz="4"/>
-              <w:right w:val="single" w:color="A6A6A6" w:sz="4"/>
-            </w:tcBorders>
-            <w:tcMar>
-              <w:top w:type="dxa" w:w="60"/>
-              <w:left w:type="dxa" w:w="100"/>
-              <w:bottom w:type="dxa" w:w="60"/>
-              <w:right w:type="dxa" w:w="100"/>
-            </w:tcMar>
-          </w:tcPr>
-          <w:p>
-            <w:r>
-              <w:t xml:space="preserve">Lowered intercept (≈ 0.68), and the decay is shifted to shorter times. Multiply scattered photons decorrelate faster, which gives an artificially small apparent size.</w:t>
-            </w:r>
-          </w:p>
-        </w:tc>
-      </w:tr>
-      <w:tr>
-        <w:trPr>
-          <w:tblHeader w:val="false"/>
-        </w:trPr>
-        <w:tc>
-          <w:tcPr>
-            <w:tcW w:type="dxa" w:w="1300"/>
-            <w:tcBorders>
-              <w:top w:val="single" w:color="A6A6A6" w:sz="4"/>
-              <w:left w:val="single" w:color="A6A6A6" w:sz="4"/>
-              <w:bottom w:val="single" w:color="A6A6A6" w:sz="4"/>
-              <w:right w:val="single" w:color="A6A6A6" w:sz="4"/>
-            </w:tcBorders>
-            <w:tcMar>
-              <w:top w:type="dxa" w:w="60"/>
-              <w:left w:type="dxa" w:w="100"/>
-              <w:bottom w:type="dxa" w:w="60"/>
-              <w:right w:type="dxa" w:w="100"/>
-            </w:tcMar>
-          </w:tcPr>
-          <w:p>
-            <w:r>
-              <w:rPr>
-                <w:b/>
-                <w:bCs/>
-              </w:rPr>
-              <w:t xml:space="preserve">Orange</w:t>
-            </w:r>
-          </w:p>
-        </w:tc>
-        <w:tc>
-          <w:tcPr>
-            <w:tcW w:type="dxa" w:w="2200"/>
-            <w:tcBorders>
-              <w:top w:val="single" w:color="A6A6A6" w:sz="4"/>
-              <w:left w:val="single" w:color="A6A6A6" w:sz="4"/>
-              <w:bottom w:val="single" w:color="A6A6A6" w:sz="4"/>
-              <w:right w:val="single" w:color="A6A6A6" w:sz="4"/>
-            </w:tcBorders>
-            <w:tcMar>
-              <w:top w:type="dxa" w:w="60"/>
-              <w:left w:type="dxa" w:w="100"/>
-              <w:bottom w:type="dxa" w:w="60"/>
-              <w:right w:type="dxa" w:w="100"/>
-            </w:tcMar>
-          </w:tcPr>
-          <w:p>
-            <w:r>
-              <w:rPr>
-                <w:b/>
-                <w:bCs/>
-              </w:rPr>
-              <w:t xml:space="preserve">Fluorescence</w:t>
-            </w:r>
-          </w:p>
-        </w:tc>
-        <w:tc>
-          <w:tcPr>
-            <w:tcW w:type="dxa" w:w="5860"/>
-            <w:tcBorders>
-              <w:top w:val="single" w:color="A6A6A6" w:sz="4"/>
-              <w:left w:val="single" w:color="A6A6A6" w:sz="4"/>
-              <w:bottom w:val="single" w:color="A6A6A6" w:sz="4"/>
-              <w:right w:val="single" w:color="A6A6A6" w:sz="4"/>
-            </w:tcBorders>
-            <w:tcMar>
-              <w:top w:type="dxa" w:w="60"/>
-              <w:left w:type="dxa" w:w="100"/>
-              <w:bottom w:type="dxa" w:w="60"/>
-              <w:right w:type="dxa" w:w="100"/>
-            </w:tcMar>
-          </w:tcPr>
-          <w:p>
-            <w:r>
-              <w:t xml:space="preserve">Very low intercept (≈ 0.05–0.07). Fluorescent light is uncorrelated background, so the correlation amplitude collapses.</w:t>
-            </w:r>
-          </w:p>
-        </w:tc>
-      </w:tr>
-      <w:tr>
-        <w:trPr>
-          <w:tblHeader w:val="false"/>
-        </w:trPr>
-        <w:tc>
-          <w:tcPr>
-            <w:tcW w:type="dxa" w:w="1300"/>
-            <w:tcBorders>
-              <w:top w:val="single" w:color="A6A6A6" w:sz="4"/>
-              <w:left w:val="single" w:color="A6A6A6" w:sz="4"/>
-              <w:bottom w:val="single" w:color="A6A6A6" w:sz="4"/>
-              <w:right w:val="single" w:color="A6A6A6" w:sz="4"/>
-            </w:tcBorders>
-            <w:tcMar>
-              <w:top w:type="dxa" w:w="60"/>
-              <w:left w:type="dxa" w:w="100"/>
-              <w:bottom w:type="dxa" w:w="60"/>
-              <w:right w:type="dxa" w:w="100"/>
-            </w:tcMar>
-          </w:tcPr>
-          <w:p>
-            <w:r>
-              <w:rPr>
-                <w:b/>
-                <w:bCs/>
-              </w:rPr>
-              <w:t xml:space="preserve">Red</w:t>
-            </w:r>
-          </w:p>
-        </w:tc>
-        <w:tc>
-          <w:tcPr>
-            <w:tcW w:type="dxa" w:w="2200"/>
-            <w:tcBorders>
-              <w:top w:val="single" w:color="A6A6A6" w:sz="4"/>
-              <w:left w:val="single" w:color="A6A6A6" w:sz="4"/>
-              <w:bottom w:val="single" w:color="A6A6A6" w:sz="4"/>
-              <w:right w:val="single" w:color="A6A6A6" w:sz="4"/>
-            </w:tcBorders>
-            <w:tcMar>
-              <w:top w:type="dxa" w:w="60"/>
-              <w:left w:type="dxa" w:w="100"/>
-              <w:bottom w:type="dxa" w:w="60"/>
-              <w:right w:type="dxa" w:w="100"/>
-            </w:tcMar>
-          </w:tcPr>
-          <w:p>
-            <w:r>
-              <w:rPr>
-                <w:b/>
-                <w:bCs/>
-              </w:rPr>
-              <w:t xml:space="preserve">Number fluctuations</w:t>
-            </w:r>
-          </w:p>
-        </w:tc>
-        <w:tc>
-          <w:tcPr>
-            <w:tcW w:type="dxa" w:w="5860"/>
-            <w:tcBorders>
-              <w:top w:val="single" w:color="A6A6A6" w:sz="4"/>
-              <w:left w:val="single" w:color="A6A6A6" w:sz="4"/>
-              <w:bottom w:val="single" w:color="A6A6A6" w:sz="4"/>
-              <w:right w:val="single" w:color="A6A6A6" w:sz="4"/>
-            </w:tcBorders>
-            <w:tcMar>
-              <w:top w:type="dxa" w:w="60"/>
-              <w:left w:type="dxa" w:w="100"/>
-              <w:bottom w:type="dxa" w:w="60"/>
-              <w:right w:type="dxa" w:w="100"/>
-            </w:tcMar>
-          </w:tcPr>
-          <w:p>
-            <w:r>
-              <w:t xml:space="preserve">Abnormally high intercept (≈ 1.17, &gt; 1) with a noisy, bumpy tail at long times (10</w:t>
-            </w:r>
-            <w:r>
-              <w:rPr>
-                <w:vertAlign w:val="superscript"/>
-              </w:rPr>
-              <w:t xml:space="preserve">5</w:t>
-            </w:r>
-            <w:r>
-              <w:t xml:space="preserve">–10</w:t>
-            </w:r>
-            <w:r>
-              <w:rPr>
-                <w:vertAlign w:val="superscript"/>
-              </w:rPr>
-              <w:t xml:space="preserve">6</w:t>
-            </w:r>
-            <w:r>
-              <w:t xml:space="preserve"> µs). This comes from a few large particles or aggregates moving in and out of the detection volume, or from very low concentration.</w:t>
-            </w:r>
-          </w:p>
-        </w:tc>
-      </w:tr>
-    </w:tbl>
-    <w:p>
-      <w:pPr>
-        <w:pBdr>
-          <w:left w:val="single" w:color="2E75B6" w:sz="18" w:space="6"/>
-        </w:pBdr>
-        <w:shd w:fill="E8F1FA" w:color="auto" w:val="clear"/>
-        <w:spacing w:after="160" w:before="80"/>
+        <w:rPr>
+          <w:b/>
+          <w:bCs/>
+          <w:i/>
+          <w:iCs/>
+        </w:rPr>
+        <w:t xml:space="preserve">Green, Orange, Red, Blue</w:t>
+      </w:r>
+    </w:p>
+    <w:p>
+      <w:pPr>
+        <w:spacing w:after="120" w:before="120"/>
       </w:pPr>
       <w:r>
         <w:rPr>
           <w:b/>
           <w:bCs/>
           <w:color w:val="1F4E79"/>
-        </w:rPr>
-        <w:t xml:space="preserve">Good = Blue;  Multiple scattering = Green;  Fluorescence = Orange;  Number fluctuations = Red</w:t>
+          <w:u w:val="single"/>
+        </w:rPr>
+        <w:t xml:space="preserve">Blue</w:t>
+      </w:r>
+      <w:r>
+        <w:rPr>
+          <w:b/>
+          <w:bCs/>
+          <w:i/>
+          <w:iCs/>
+        </w:rPr>
+        <w:t xml:space="preserve">   Good measurement</w:t>
+      </w:r>
+    </w:p>
+    <w:p>
+      <w:pPr>
+        <w:spacing w:after="120" w:before="120"/>
+      </w:pPr>
+      <w:r>
+        <w:rPr>
+          <w:b/>
+          <w:bCs/>
+          <w:color w:val="1F4E79"/>
+          <w:u w:val="single"/>
+        </w:rPr>
+        <w:t xml:space="preserve">Green</w:t>
+      </w:r>
+      <w:r>
+        <w:rPr>
+          <w:b/>
+          <w:bCs/>
+          <w:i/>
+          <w:iCs/>
+        </w:rPr>
+        <w:t xml:space="preserve">   Multiple scattering</w:t>
+      </w:r>
+    </w:p>
+    <w:p>
+      <w:pPr>
+        <w:spacing w:after="120" w:before="120"/>
+      </w:pPr>
+      <w:r>
+        <w:rPr>
+          <w:b/>
+          <w:bCs/>
+          <w:color w:val="1F4E79"/>
+          <w:u w:val="single"/>
+        </w:rPr>
+        <w:t xml:space="preserve">Orange</w:t>
+      </w:r>
+      <w:r>
+        <w:rPr>
+          <w:b/>
+          <w:bCs/>
+          <w:i/>
+          <w:iCs/>
+        </w:rPr>
+        <w:t xml:space="preserve">   Fluorescence</w:t>
+      </w:r>
+    </w:p>
+    <w:p>
+      <w:pPr>
+        <w:spacing w:after="120" w:before="120"/>
+      </w:pPr>
+      <w:r>
+        <w:rPr>
+          <w:b/>
+          <w:bCs/>
+          <w:color w:val="1F4E79"/>
+          <w:u w:val="single"/>
+        </w:rPr>
+        <w:t xml:space="preserve">Red</w:t>
+      </w:r>
+      <w:r>
+        <w:rPr>
+          <w:b/>
+          <w:bCs/>
+          <w:i/>
+          <w:iCs/>
+        </w:rPr>
+        <w:t xml:space="preserve">   Number fluctuations</w:t>
       </w:r>
     </w:p>
     <w:p>

</xml_diff>

<commit_message>
Q3: shorten answers to one point per part
Co-Authored-By: Claude Opus 5.5 <noreply@anthropic.com>
Claude-Session: https://claude.ai/code/session_01NvTkAHSaZ21cNjKtHfhBfz
</commit_message>
<xml_diff>
--- a/pharm610_assignment3/Assignment_III_Pharm610_Answers.docx
+++ b/pharm610_assignment3/Assignment_III_Pharm610_Answers.docx
@@ -1268,17 +1268,16 @@
         <w:spacing w:after="60"/>
       </w:pPr>
       <w:r>
-        <w:t xml:space="preserve">SEM scans a focused electron beam over the surface and detects secondary electrons, giving a high-depth-of-field, 3D-like image of </w:t>
-      </w:r>
-      <w:r>
-        <w:rPr>
-          <w:b/>
-          <w:bCs/>
-        </w:rPr>
-        <w:t xml:space="preserve">surface topography</w:t>
-      </w:r>
-      <w:r>
-        <w:t xml:space="preserve"> and shape.</w:t>
+        <w:t xml:space="preserve">SEM images secondary electrons from the surface, giving 3D-like topography and shape. It runs under vacuum, so dried (sputter-coated) samples are exactly what it needs.</w:t>
+      </w:r>
+    </w:p>
+    <w:p>
+      <w:pPr>
+        <w:pStyle w:val="Heading2"/>
+        <w:spacing w:after="80" w:before="160"/>
+      </w:pPr>
+      <w:r>
+        <w:t xml:space="preserve">b. Size, shape and internal structure of individual particles → TEM</w:t>
       </w:r>
     </w:p>
     <w:p>
@@ -1291,7 +1290,7 @@
         <w:spacing w:after="60"/>
       </w:pPr>
       <w:r>
-        <w:t xml:space="preserve">It works under high vacuum, so the sample must be dry anyway. Non-conductive polymer particles are usually sputter-coated (Au/Pd). A large field of view shows many particles at once.</w:t>
+        <w:t xml:space="preserve">Electrons pass through the particle, giving nm-resolution projections that show size, shape and interior features (e.g. core–shell, vesicle lumen). SEM only sees the surface.</w:t>
       </w:r>
     </w:p>
     <w:p>
@@ -1300,7 +1299,7 @@
         <w:spacing w:after="80" w:before="160"/>
       </w:pPr>
       <w:r>
-        <w:t xml:space="preserve">b. Size, shape and internal structure of individual particles → TEM</w:t>
+        <w:t xml:space="preserve">c. Morphology and aggregation state in a near-native hydrated state → Cryo-TEM</w:t>
       </w:r>
     </w:p>
     <w:p>
@@ -1313,27 +1312,16 @@
         <w:spacing w:after="60"/>
       </w:pPr>
       <w:r>
-        <w:t xml:space="preserve">In TEM, electrons are </w:t>
-      </w:r>
-      <w:r>
-        <w:rPr>
-          <w:b/>
-          <w:bCs/>
-        </w:rPr>
-        <w:t xml:space="preserve">transmitted through</w:t>
-      </w:r>
-      <w:r>
-        <w:t xml:space="preserve"> the thin specimen, giving a 2D projection at nm or sub-nm resolution. This resolves the size and shape of individual particles and their </w:t>
-      </w:r>
-      <w:r>
-        <w:rPr>
-          <w:b/>
-          <w:bCs/>
-        </w:rPr>
-        <w:t xml:space="preserve">internal structure</w:t>
-      </w:r>
-      <w:r>
-        <w:t xml:space="preserve">: core–shell organisation, vesicle membrane vs. aqueous lumen, encapsulated drug crystals, and multilayers.</w:t>
+        <w:t xml:space="preserve">The sample is vitrified in thin ice without drying or staining, so particles and their aggregation state are seen as they exist in the dispersion.</w:t>
+      </w:r>
+    </w:p>
+    <w:p>
+      <w:pPr>
+        <w:pStyle w:val="Heading2"/>
+        <w:spacing w:after="80" w:before="160"/>
+      </w:pPr>
+      <w:r>
+        <w:t xml:space="preserve">d. Spherical shape after drying → SEM/TEM (dried) vs. Cryo-TEM</w:t>
       </w:r>
     </w:p>
     <w:p>
@@ -1346,7 +1334,7 @@
         <w:spacing w:after="60"/>
       </w:pPr>
       <w:r>
-        <w:t xml:space="preserve">SEM only sees the surface and cannot reveal the interior. Polymer particles have low contrast, so negative staining (e.g. uranyl acetate or phosphotungstic acid) is normally used. Cryo-TEM also gives internal structure if the hydrated state is needed.</w:t>
+        <w:t xml:space="preserve">Cryo-TEM shows the native shape. If dried particles in SEM/TEM are still round and similar in size, the shape is kept; flattening, collapse or fusion means drying changes it.</w:t>
       </w:r>
     </w:p>
     <w:p>
@@ -1355,7 +1343,7 @@
         <w:spacing w:after="80" w:before="160"/>
       </w:pPr>
       <w:r>
-        <w:t xml:space="preserve">c. Morphology and aggregation state in a near-native hydrated state → Cryo-TEM</w:t>
+        <w:t xml:space="preserve">Why particle dimensions differ between techniques</w:t>
       </w:r>
     </w:p>
     <w:p>
@@ -1368,17 +1356,14 @@
         <w:spacing w:after="60"/>
       </w:pPr>
       <w:r>
-        <w:t xml:space="preserve">The dispersion is blotted into a thin film and plunge-frozen in liquid ethane, so the water vitrifies (amorphous ice). Particles are imaged </w:t>
-      </w:r>
-      <w:r>
-        <w:rPr>
-          <w:b/>
-          <w:bCs/>
-        </w:rPr>
-        <w:t xml:space="preserve">as they exist in the aqueous dispersion</w:t>
-      </w:r>
-      <w:r>
-        <w:t xml:space="preserve">, with no drying, staining or fixation.</w:t>
+        <w:rPr>
+          <w:b/>
+          <w:bCs/>
+        </w:rPr>
+        <w:t xml:space="preserve">Drying:</w:t>
+      </w:r>
+      <w:r>
+        <w:t xml:space="preserve"> SEM/TEM samples are dried, so the hydrated polymer shell shrinks or flattens; cryo-TEM keeps it swollen.</w:t>
       </w:r>
     </w:p>
     <w:p>
@@ -1391,16 +1376,14 @@
         <w:spacing w:after="60"/>
       </w:pPr>
       <w:r>
-        <w:t xml:space="preserve">This preserves the swollen, hydrated corona and the true aggregation state. Real aggregates in solution can then be told apart from artefactual clustering caused by drying on the grid.</w:t>
-      </w:r>
-    </w:p>
-    <w:p>
-      <w:pPr>
-        <w:pStyle w:val="Heading2"/>
-        <w:spacing w:after="80" w:before="160"/>
-      </w:pPr>
-      <w:r>
-        <w:t xml:space="preserve">d. Do particles keep their spherical morphology after drying? → SEM and/or TEM of a dried sample, compared with Cryo-TEM</w:t>
+        <w:rPr>
+          <w:b/>
+          <w:bCs/>
+        </w:rPr>
+        <w:t xml:space="preserve">Contrast:</w:t>
+      </w:r>
+      <w:r>
+        <w:t xml:space="preserve"> the low-density polymer shell is hard to see in TEM/cryo-TEM, so often only the core is measured.</w:t>
       </w:r>
     </w:p>
     <w:p>
@@ -1413,7 +1396,14 @@
         <w:spacing w:after="60"/>
       </w:pPr>
       <w:r>
-        <w:t xml:space="preserve">Cryo-TEM is the reference for the native, hydrated shape and size. SEM (and conventional TEM) show the same particles after drying.</w:t>
+        <w:rPr>
+          <w:b/>
+          <w:bCs/>
+        </w:rPr>
+        <w:t xml:space="preserve">Coating and beam damage:</w:t>
+      </w:r>
+      <w:r>
+        <w:t xml:space="preserve"> the SEM metal coating adds a few nm; the electron beam can shrink polymer particles.</w:t>
       </w:r>
     </w:p>
     <w:p>
@@ -1426,136 +1416,14 @@
         <w:spacing w:after="60"/>
       </w:pPr>
       <w:r>
-        <w:t xml:space="preserve">If the dried particles are still round and similar in size, the morphology is preserved. Flattening ("pancaking"), buckling, collapse, shrinkage, coalescence or film formation show that drying changes the morphology. SEM is especially useful here because its 3D-like topographic contrast (and stage tilting) reveals flattening or collapse.</w:t>
-      </w:r>
-    </w:p>
-    <w:p>
-      <w:pPr>
-        <w:pStyle w:val="Heading2"/>
-        <w:spacing w:after="80" w:before="160"/>
-      </w:pPr>
-      <w:r>
-        <w:t xml:space="preserve">Why particle dimensions differ between microscopy techniques</w:t>
-      </w:r>
-    </w:p>
-    <w:p>
-      <w:pPr>
-        <w:pStyle w:val="ListParagraph"/>
-        <w:numPr>
-          <w:ilvl w:val="0"/>
-          <w:numId w:val="2"/>
-        </w:numPr>
-        <w:spacing w:after="60"/>
-      </w:pPr>
-      <w:r>
-        <w:rPr>
-          <w:b/>
-          <w:bCs/>
-        </w:rPr>
-        <w:t xml:space="preserve">Sample state.</w:t>
-      </w:r>
-      <w:r>
-        <w:t xml:space="preserve"> SEM and TEM image dried particles under vacuum. The hydrated polymer shell (e.g. a PEG corona) collapses, so particles shrink. Soft particles can also spread and flatten on the grid, which enlarges the projected lateral diameter. Cryo-TEM keeps the particle hydrated and swollen.</w:t>
-      </w:r>
-    </w:p>
-    <w:p>
-      <w:pPr>
-        <w:pStyle w:val="ListParagraph"/>
-        <w:numPr>
-          <w:ilvl w:val="0"/>
-          <w:numId w:val="2"/>
-        </w:numPr>
-        <w:spacing w:after="60"/>
-      </w:pPr>
-      <w:r>
-        <w:rPr>
-          <w:b/>
-          <w:bCs/>
-        </w:rPr>
-        <w:t xml:space="preserve">Contrast.</w:t>
-      </w:r>
-      <w:r>
-        <w:t xml:space="preserve"> Low-density, highly hydrated polymer shells scatter electrons weakly, so TEM and cryo-TEM often show only the dense core and underestimate the full diameter. Staining can add a halo that blurs the edge.</w:t>
-      </w:r>
-    </w:p>
-    <w:p>
-      <w:pPr>
-        <w:pStyle w:val="ListParagraph"/>
-        <w:numPr>
-          <w:ilvl w:val="0"/>
-          <w:numId w:val="2"/>
-        </w:numPr>
-        <w:spacing w:after="60"/>
-      </w:pPr>
-      <w:r>
-        <w:rPr>
-          <w:b/>
-          <w:bCs/>
-        </w:rPr>
-        <w:t xml:space="preserve">Coating.</w:t>
-      </w:r>
-      <w:r>
-        <w:t xml:space="preserve"> In SEM, the conductive metal coating (a few nm) adds to the measured size, and edge brightness makes boundaries less sharp.</w:t>
-      </w:r>
-    </w:p>
-    <w:p>
-      <w:pPr>
-        <w:pStyle w:val="ListParagraph"/>
-        <w:numPr>
-          <w:ilvl w:val="0"/>
-          <w:numId w:val="2"/>
-        </w:numPr>
-        <w:spacing w:after="60"/>
-      </w:pPr>
-      <w:r>
-        <w:rPr>
-          <w:b/>
-          <w:bCs/>
-        </w:rPr>
-        <w:t xml:space="preserve">Imaging geometry.</w:t>
-      </w:r>
-      <w:r>
-        <w:t xml:space="preserve"> TEM gives a 2D projection, while SEM shows the surface. Orientation and overlap of particles change the apparent size.</w:t>
-      </w:r>
-    </w:p>
-    <w:p>
-      <w:pPr>
-        <w:pStyle w:val="ListParagraph"/>
-        <w:numPr>
-          <w:ilvl w:val="0"/>
-          <w:numId w:val="2"/>
-        </w:numPr>
-        <w:spacing w:after="60"/>
-      </w:pPr>
-      <w:r>
-        <w:rPr>
-          <w:b/>
-          <w:bCs/>
-        </w:rPr>
-        <w:t xml:space="preserve">Beam damage.</w:t>
-      </w:r>
-      <w:r>
-        <w:t xml:space="preserve"> Polymers can shrink, melt or degrade under the electron beam.</w:t>
-      </w:r>
-    </w:p>
-    <w:p>
-      <w:pPr>
-        <w:pStyle w:val="ListParagraph"/>
-        <w:numPr>
-          <w:ilvl w:val="0"/>
-          <w:numId w:val="2"/>
-        </w:numPr>
-        <w:spacing w:after="60"/>
-      </w:pPr>
-      <w:r>
-        <w:rPr>
-          <w:b/>
-          <w:bCs/>
-        </w:rPr>
-        <w:t xml:space="preserve">Statistics and analysis.</w:t>
-      </w:r>
-      <w:r>
-        <w:t xml:space="preserve"> Microscopy counts a limited number of particles (number-weighted, with possible sampling bias such as large particles being excluded from thin cryo ice). Results also depend on the resolution and on the threshold used in image analysis. Ensemble methods such as DLS give intensity-weighted averages over millions of particles.</w:t>
+        <w:rPr>
+          <w:b/>
+          <w:bCs/>
+        </w:rPr>
+        <w:t xml:space="preserve">Sampling:</w:t>
+      </w:r>
+      <w:r>
+        <w:t xml:space="preserve"> only a limited number of particles are measured, and edge thresholds in image analysis vary.</w:t>
       </w:r>
     </w:p>
     <w:p>

</xml_diff>

<commit_message>
Q3d: answer SEM + Cryo-TEM
Co-Authored-By: Claude Opus 5.5 <noreply@anthropic.com>
Claude-Session: https://claude.ai/code/session_01NvTkAHSaZ21cNjKtHfhBfz
</commit_message>
<xml_diff>
--- a/pharm610_assignment3/Assignment_III_Pharm610_Answers.docx
+++ b/pharm610_assignment3/Assignment_III_Pharm610_Answers.docx
@@ -1321,7 +1321,7 @@
         <w:spacing w:after="80" w:before="160"/>
       </w:pPr>
       <w:r>
-        <w:t xml:space="preserve">d. Spherical shape after drying → SEM/TEM (dried) vs. Cryo-TEM</w:t>
+        <w:t xml:space="preserve">d. Spherical shape after drying → SEM + Cryo-TEM</w:t>
       </w:r>
     </w:p>
     <w:p>
@@ -1334,7 +1334,7 @@
         <w:spacing w:after="60"/>
       </w:pPr>
       <w:r>
-        <w:t xml:space="preserve">Cryo-TEM shows the native shape. If dried particles in SEM/TEM are still round and similar in size, the shape is kept; flattening, collapse or fusion means drying changes it.</w:t>
+        <w:t xml:space="preserve">Cryo-TEM shows the native, hydrated shape; SEM shows the same particles after drying. If they are still round and similar in size in SEM, the shape is kept; flattening, collapse or fusion means drying changes it.</w:t>
       </w:r>
     </w:p>
     <w:p>

</xml_diff>

<commit_message>
Q3d: reword in plain language
Co-Authored-By: Claude Opus 5.5 <noreply@anthropic.com>
Claude-Session: https://claude.ai/code/session_01NvTkAHSaZ21cNjKtHfhBfz
</commit_message>
<xml_diff>
--- a/pharm610_assignment3/Assignment_III_Pharm610_Answers.docx
+++ b/pharm610_assignment3/Assignment_III_Pharm610_Answers.docx
@@ -1321,7 +1321,7 @@
         <w:spacing w:after="80" w:before="160"/>
       </w:pPr>
       <w:r>
-        <w:t xml:space="preserve">d. Spherical shape after drying → SEM + Cryo-TEM</w:t>
+        <w:t xml:space="preserve">d. Spherical shape after drying → use both SEM and Cryo-TEM, and compare them</w:t>
       </w:r>
     </w:p>
     <w:p>
@@ -1334,7 +1334,7 @@
         <w:spacing w:after="60"/>
       </w:pPr>
       <w:r>
-        <w:t xml:space="preserve">Cryo-TEM shows the native, hydrated shape; SEM shows the same particles after drying. If they are still round and similar in size in SEM, the shape is kept; flattening, collapse or fusion means drying changes it.</w:t>
+        <w:t xml:space="preserve">Cryo-TEM shows what the particles look like before drying (in water). SEM shows what they look like after drying. If the particles look round and the same size in both, they keep their shape after drying. If they look flat, collapsed or stuck together in SEM, drying has changed them.</w:t>
       </w:r>
     </w:p>
     <w:p>

</xml_diff>

<commit_message>
Q3: rewrite briefly, one line per part
Co-Authored-By: Claude Opus 5.5 <noreply@anthropic.com>
Claude-Session: https://claude.ai/code/session_01NvTkAHSaZ21cNjKtHfhBfz
</commit_message>
<xml_diff>
--- a/pharm610_assignment3/Assignment_III_Pharm610_Answers.docx
+++ b/pharm610_assignment3/Assignment_III_Pharm610_Answers.docx
@@ -1246,184 +1246,82 @@
         <w:spacing w:after="120" w:before="240"/>
       </w:pPr>
       <w:r>
-        <w:t xml:space="preserve">3. Selecting the appropriate microscopy technique (6 marks)</w:t>
-      </w:r>
-    </w:p>
-    <w:p>
-      <w:pPr>
-        <w:pStyle w:val="Heading2"/>
-        <w:spacing w:after="80" w:before="160"/>
-      </w:pPr>
-      <w:r>
-        <w:t xml:space="preserve">a. Surface morphology and shape of a dried sample → SEM</w:t>
-      </w:r>
-    </w:p>
-    <w:p>
-      <w:pPr>
-        <w:pStyle w:val="ListParagraph"/>
-        <w:numPr>
-          <w:ilvl w:val="0"/>
-          <w:numId w:val="2"/>
-        </w:numPr>
-        <w:spacing w:after="60"/>
-      </w:pPr>
-      <w:r>
-        <w:t xml:space="preserve">SEM images secondary electrons from the surface, giving 3D-like topography and shape. It runs under vacuum, so dried (sputter-coated) samples are exactly what it needs.</w:t>
-      </w:r>
-    </w:p>
-    <w:p>
-      <w:pPr>
-        <w:pStyle w:val="Heading2"/>
-        <w:spacing w:after="80" w:before="160"/>
-      </w:pPr>
-      <w:r>
-        <w:t xml:space="preserve">b. Size, shape and internal structure of individual particles → TEM</w:t>
-      </w:r>
-    </w:p>
-    <w:p>
-      <w:pPr>
-        <w:pStyle w:val="ListParagraph"/>
-        <w:numPr>
-          <w:ilvl w:val="0"/>
-          <w:numId w:val="2"/>
-        </w:numPr>
-        <w:spacing w:after="60"/>
-      </w:pPr>
-      <w:r>
-        <w:t xml:space="preserve">Electrons pass through the particle, giving nm-resolution projections that show size, shape and interior features (e.g. core–shell, vesicle lumen). SEM only sees the surface.</w:t>
-      </w:r>
-    </w:p>
-    <w:p>
-      <w:pPr>
-        <w:pStyle w:val="Heading2"/>
-        <w:spacing w:after="80" w:before="160"/>
-      </w:pPr>
-      <w:r>
-        <w:t xml:space="preserve">c. Morphology and aggregation state in a near-native hydrated state → Cryo-TEM</w:t>
-      </w:r>
-    </w:p>
-    <w:p>
-      <w:pPr>
-        <w:pStyle w:val="ListParagraph"/>
-        <w:numPr>
-          <w:ilvl w:val="0"/>
-          <w:numId w:val="2"/>
-        </w:numPr>
-        <w:spacing w:after="60"/>
-      </w:pPr>
-      <w:r>
-        <w:t xml:space="preserve">The sample is vitrified in thin ice without drying or staining, so particles and their aggregation state are seen as they exist in the dispersion.</w:t>
-      </w:r>
-    </w:p>
-    <w:p>
-      <w:pPr>
-        <w:pStyle w:val="Heading2"/>
-        <w:spacing w:after="80" w:before="160"/>
-      </w:pPr>
-      <w:r>
-        <w:t xml:space="preserve">d. Spherical shape after drying → use both SEM and Cryo-TEM, and compare them</w:t>
-      </w:r>
-    </w:p>
-    <w:p>
-      <w:pPr>
-        <w:pStyle w:val="ListParagraph"/>
-        <w:numPr>
-          <w:ilvl w:val="0"/>
-          <w:numId w:val="2"/>
-        </w:numPr>
-        <w:spacing w:after="60"/>
-      </w:pPr>
-      <w:r>
-        <w:t xml:space="preserve">Cryo-TEM shows what the particles look like before drying (in water). SEM shows what they look like after drying. If the particles look round and the same size in both, they keep their shape after drying. If they look flat, collapsed or stuck together in SEM, drying has changed them.</w:t>
-      </w:r>
-    </w:p>
-    <w:p>
-      <w:pPr>
-        <w:pStyle w:val="Heading2"/>
-        <w:spacing w:after="80" w:before="160"/>
-      </w:pPr>
-      <w:r>
-        <w:t xml:space="preserve">Why particle dimensions differ between techniques</w:t>
-      </w:r>
-    </w:p>
-    <w:p>
-      <w:pPr>
-        <w:pStyle w:val="ListParagraph"/>
-        <w:numPr>
-          <w:ilvl w:val="0"/>
-          <w:numId w:val="2"/>
-        </w:numPr>
-        <w:spacing w:after="60"/>
-      </w:pPr>
-      <w:r>
-        <w:rPr>
-          <w:b/>
-          <w:bCs/>
-        </w:rPr>
-        <w:t xml:space="preserve">Drying:</w:t>
-      </w:r>
-      <w:r>
-        <w:t xml:space="preserve"> SEM/TEM samples are dried, so the hydrated polymer shell shrinks or flattens; cryo-TEM keeps it swollen.</w:t>
-      </w:r>
-    </w:p>
-    <w:p>
-      <w:pPr>
-        <w:pStyle w:val="ListParagraph"/>
-        <w:numPr>
-          <w:ilvl w:val="0"/>
-          <w:numId w:val="2"/>
-        </w:numPr>
-        <w:spacing w:after="60"/>
-      </w:pPr>
-      <w:r>
-        <w:rPr>
-          <w:b/>
-          <w:bCs/>
-        </w:rPr>
-        <w:t xml:space="preserve">Contrast:</w:t>
-      </w:r>
-      <w:r>
-        <w:t xml:space="preserve"> the low-density polymer shell is hard to see in TEM/cryo-TEM, so often only the core is measured.</w:t>
-      </w:r>
-    </w:p>
-    <w:p>
-      <w:pPr>
-        <w:pStyle w:val="ListParagraph"/>
-        <w:numPr>
-          <w:ilvl w:val="0"/>
-          <w:numId w:val="2"/>
-        </w:numPr>
-        <w:spacing w:after="60"/>
-      </w:pPr>
-      <w:r>
-        <w:rPr>
-          <w:b/>
-          <w:bCs/>
-        </w:rPr>
-        <w:t xml:space="preserve">Coating and beam damage:</w:t>
-      </w:r>
-      <w:r>
-        <w:t xml:space="preserve"> the SEM metal coating adds a few nm; the electron beam can shrink polymer particles.</w:t>
-      </w:r>
-    </w:p>
-    <w:p>
-      <w:pPr>
-        <w:pStyle w:val="ListParagraph"/>
-        <w:numPr>
-          <w:ilvl w:val="0"/>
-          <w:numId w:val="2"/>
-        </w:numPr>
-        <w:spacing w:after="60"/>
-      </w:pPr>
-      <w:r>
-        <w:rPr>
-          <w:b/>
-          <w:bCs/>
-        </w:rPr>
-        <w:t xml:space="preserve">Sampling:</w:t>
-      </w:r>
-      <w:r>
-        <w:t xml:space="preserve"> only a limited number of particles are measured, and edge thresholds in image analysis vary.</w:t>
+        <w:t xml:space="preserve">3. Selecting the appropriate technique (6 marks)</w:t>
+      </w:r>
+    </w:p>
+    <w:p>
+      <w:pPr>
+        <w:spacing w:after="100"/>
+      </w:pPr>
+      <w:r>
+        <w:rPr>
+          <w:b/>
+          <w:bCs/>
+        </w:rPr>
+        <w:t xml:space="preserve">a. SEM.</w:t>
+      </w:r>
+      <w:r>
+        <w:t xml:space="preserve"> It images the particle surface, so it shows the surface morphology and shape of dried particles.</w:t>
+      </w:r>
+    </w:p>
+    <w:p>
+      <w:pPr>
+        <w:spacing w:after="100"/>
+      </w:pPr>
+      <w:r>
+        <w:rPr>
+          <w:b/>
+          <w:bCs/>
+        </w:rPr>
+        <w:t xml:space="preserve">b. TEM.</w:t>
+      </w:r>
+      <w:r>
+        <w:t xml:space="preserve"> Electrons pass through the particle, so it shows size, shape and internal structure (e.g. core–shell).</w:t>
+      </w:r>
+    </w:p>
+    <w:p>
+      <w:pPr>
+        <w:spacing w:after="100"/>
+      </w:pPr>
+      <w:r>
+        <w:rPr>
+          <w:b/>
+          <w:bCs/>
+        </w:rPr>
+        <w:t xml:space="preserve">c. Cryo-TEM.</w:t>
+      </w:r>
+      <w:r>
+        <w:t xml:space="preserve"> The sample is frozen in water without drying, so particles and aggregates are seen in their natural hydrated state.</w:t>
+      </w:r>
+    </w:p>
+    <w:p>
+      <w:pPr>
+        <w:spacing w:after="100"/>
+      </w:pPr>
+      <w:r>
+        <w:rPr>
+          <w:b/>
+          <w:bCs/>
+        </w:rPr>
+        <w:t xml:space="preserve">d. SEM and Cryo-TEM.</w:t>
+      </w:r>
+      <w:r>
+        <w:t xml:space="preserve"> Cryo-TEM shows the shape before drying and SEM shows it after drying. If the particles are still round in SEM, they keep their shape.</w:t>
+      </w:r>
+    </w:p>
+    <w:p>
+      <w:pPr>
+        <w:spacing w:after="100"/>
+      </w:pPr>
+      <w:r>
+        <w:rPr>
+          <w:b/>
+          <w:bCs/>
+        </w:rPr>
+        <w:t xml:space="preserve">Why sizes differ:</w:t>
+      </w:r>
+      <w:r>
+        <w:t xml:space="preserve"> SEM and TEM samples are dried, so the polymer shell shrinks or flattens, while Cryo-TEM keeps particles hydrated and swollen. The thin polymer shell is also hard to see in TEM, so often only the core is measured, and the metal coating used in SEM adds a few nm.</w:t>
       </w:r>
     </w:p>
     <w:p>

</xml_diff>